<commit_message>
Working on submission 2
</commit_message>
<xml_diff>
--- a/Task1.docx
+++ b/Task1.docx
@@ -2750,13 +2750,7 @@
         <w:t>meet or exceed their expectations</w:t>
       </w:r>
       <w:r>
-        <w:t xml:space="preserve">. This will be done by using existing on-site hardware where possible, custom-built applications along with AI services and connections to M365 apps.  </w:t>
-      </w:r>
-      <w:r>
-        <w:t>The proposed system will aid users in all aspects of customer relations and the sales process</w:t>
-      </w:r>
-      <w:r>
-        <w:t xml:space="preserve">. This includes an intuitive ticketing system to manage all aspects of communication with customers, generating detailed sales reports, forecasting future  financial gains or losses, along with automated contracting tasks and the process from quote to sale. </w:t>
+        <w:t xml:space="preserve">. This will be done by using existing on-site hardware where possible, custom-built applications along with AI services and connections to M365 apps.  The proposed system will aid users in all aspects of customer relations and the sales process. This includes an intuitive ticketing system to manage all aspects of communication with customers, generating detailed sales reports, forecasting future  financial gains or losses, along with automated contracting tasks and the process from quote to sale. </w:t>
       </w:r>
     </w:p>
     <w:p>
@@ -3007,6 +3001,268 @@
           <w:szCs w:val="22"/>
         </w:rPr>
         <w:t xml:space="preserve"> and grow in their market of expertise.</w:t>
+      </w:r>
+    </w:p>
+    <w:p>
+      <w:pPr>
+        <w:pStyle w:val="CommentText"/>
+        <w:rPr>
+          <w:sz w:val="22"/>
+          <w:szCs w:val="22"/>
+        </w:rPr>
+      </w:pPr>
+      <w:r>
+        <w:rPr>
+          <w:sz w:val="22"/>
+          <w:szCs w:val="22"/>
+          <w:u w:val="single"/>
+        </w:rPr>
+        <w:t>Goals:</w:t>
+      </w:r>
+    </w:p>
+    <w:p>
+      <w:pPr>
+        <w:pStyle w:val="CommentText"/>
+        <w:numPr>
+          <w:ilvl w:val="0"/>
+          <w:numId w:val="29"/>
+        </w:numPr>
+        <w:rPr>
+          <w:sz w:val="22"/>
+          <w:szCs w:val="22"/>
+        </w:rPr>
+      </w:pPr>
+      <w:r>
+        <w:rPr>
+          <w:sz w:val="22"/>
+          <w:szCs w:val="22"/>
+        </w:rPr>
+        <w:t>To provide a comprehensive system that covers all of the customers’ requirements</w:t>
+      </w:r>
+    </w:p>
+    <w:p>
+      <w:pPr>
+        <w:pStyle w:val="CommentText"/>
+        <w:numPr>
+          <w:ilvl w:val="0"/>
+          <w:numId w:val="29"/>
+        </w:numPr>
+        <w:rPr>
+          <w:sz w:val="22"/>
+          <w:szCs w:val="22"/>
+        </w:rPr>
+      </w:pPr>
+      <w:r>
+        <w:rPr>
+          <w:sz w:val="22"/>
+          <w:szCs w:val="22"/>
+        </w:rPr>
+        <w:t>To provide a simple and visually satisfying user experience</w:t>
+      </w:r>
+    </w:p>
+    <w:p>
+      <w:pPr>
+        <w:pStyle w:val="CommentText"/>
+        <w:numPr>
+          <w:ilvl w:val="0"/>
+          <w:numId w:val="29"/>
+        </w:numPr>
+        <w:rPr>
+          <w:sz w:val="22"/>
+          <w:szCs w:val="22"/>
+        </w:rPr>
+      </w:pPr>
+      <w:r>
+        <w:rPr>
+          <w:sz w:val="22"/>
+          <w:szCs w:val="22"/>
+        </w:rPr>
+        <w:t>To provide a robust and secure system to move and store sensitive information</w:t>
+      </w:r>
+    </w:p>
+    <w:p>
+      <w:pPr>
+        <w:pStyle w:val="CommentText"/>
+        <w:numPr>
+          <w:ilvl w:val="0"/>
+          <w:numId w:val="29"/>
+        </w:numPr>
+        <w:rPr>
+          <w:sz w:val="22"/>
+          <w:szCs w:val="22"/>
+        </w:rPr>
+      </w:pPr>
+      <w:r>
+        <w:rPr>
+          <w:sz w:val="22"/>
+          <w:szCs w:val="22"/>
+        </w:rPr>
+        <w:lastRenderedPageBreak/>
+        <w:t xml:space="preserve">To provide scheduled security and functional updates. </w:t>
+      </w:r>
+    </w:p>
+    <w:p>
+      <w:pPr>
+        <w:pStyle w:val="CommentText"/>
+        <w:rPr>
+          <w:sz w:val="22"/>
+          <w:szCs w:val="22"/>
+        </w:rPr>
+      </w:pPr>
+      <w:r>
+        <w:rPr>
+          <w:sz w:val="22"/>
+          <w:szCs w:val="22"/>
+          <w:u w:val="single"/>
+        </w:rPr>
+        <w:t>Objectives:</w:t>
+      </w:r>
+    </w:p>
+    <w:p>
+      <w:pPr>
+        <w:pStyle w:val="CommentText"/>
+        <w:numPr>
+          <w:ilvl w:val="0"/>
+          <w:numId w:val="30"/>
+        </w:numPr>
+        <w:rPr>
+          <w:sz w:val="22"/>
+          <w:szCs w:val="22"/>
+        </w:rPr>
+      </w:pPr>
+      <w:r>
+        <w:rPr>
+          <w:sz w:val="22"/>
+          <w:szCs w:val="22"/>
+        </w:rPr>
+        <w:t>Observe and upgrade existing hardware as needed</w:t>
+      </w:r>
+    </w:p>
+    <w:p>
+      <w:pPr>
+        <w:pStyle w:val="CommentText"/>
+        <w:numPr>
+          <w:ilvl w:val="0"/>
+          <w:numId w:val="30"/>
+        </w:numPr>
+        <w:rPr>
+          <w:sz w:val="22"/>
+          <w:szCs w:val="22"/>
+        </w:rPr>
+      </w:pPr>
+      <w:r>
+        <w:rPr>
+          <w:sz w:val="22"/>
+          <w:szCs w:val="22"/>
+        </w:rPr>
+        <w:t>Beta release as soon as the first features are functional for user testing</w:t>
+      </w:r>
+    </w:p>
+    <w:p>
+      <w:pPr>
+        <w:pStyle w:val="CommentText"/>
+        <w:numPr>
+          <w:ilvl w:val="0"/>
+          <w:numId w:val="30"/>
+        </w:numPr>
+        <w:rPr>
+          <w:sz w:val="22"/>
+          <w:szCs w:val="22"/>
+        </w:rPr>
+      </w:pPr>
+      <w:r>
+        <w:rPr>
+          <w:sz w:val="22"/>
+          <w:szCs w:val="22"/>
+        </w:rPr>
+        <w:t>Deliver the first phases of the security infrastructure</w:t>
+      </w:r>
+    </w:p>
+    <w:p>
+      <w:pPr>
+        <w:pStyle w:val="CommentText"/>
+        <w:numPr>
+          <w:ilvl w:val="0"/>
+          <w:numId w:val="30"/>
+        </w:numPr>
+        <w:rPr>
+          <w:sz w:val="22"/>
+          <w:szCs w:val="22"/>
+        </w:rPr>
+      </w:pPr>
+      <w:r>
+        <w:rPr>
+          <w:sz w:val="22"/>
+          <w:szCs w:val="22"/>
+        </w:rPr>
+        <w:t>Incrementally release the required functions as they are complete</w:t>
+      </w:r>
+      <w:r>
+        <w:rPr>
+          <w:sz w:val="22"/>
+          <w:szCs w:val="22"/>
+        </w:rPr>
+        <w:t xml:space="preserve"> and stable.</w:t>
+      </w:r>
+    </w:p>
+    <w:p>
+      <w:pPr>
+        <w:pStyle w:val="CommentText"/>
+        <w:numPr>
+          <w:ilvl w:val="0"/>
+          <w:numId w:val="30"/>
+        </w:numPr>
+        <w:rPr>
+          <w:sz w:val="22"/>
+          <w:szCs w:val="22"/>
+        </w:rPr>
+      </w:pPr>
+      <w:r>
+        <w:rPr>
+          <w:sz w:val="22"/>
+          <w:szCs w:val="22"/>
+        </w:rPr>
+        <w:t>Release user tested and approved systems for production use alongside current system.</w:t>
+      </w:r>
+    </w:p>
+    <w:p>
+      <w:pPr>
+        <w:pStyle w:val="CommentText"/>
+        <w:numPr>
+          <w:ilvl w:val="0"/>
+          <w:numId w:val="30"/>
+        </w:numPr>
+        <w:rPr>
+          <w:sz w:val="22"/>
+          <w:szCs w:val="22"/>
+        </w:rPr>
+      </w:pPr>
+      <w:r>
+        <w:rPr>
+          <w:sz w:val="22"/>
+          <w:szCs w:val="22"/>
+        </w:rPr>
+        <w:t>Decommission the current system once all requirements are satisfied.</w:t>
+      </w:r>
+    </w:p>
+    <w:p>
+      <w:pPr>
+        <w:pStyle w:val="CommentText"/>
+        <w:numPr>
+          <w:ilvl w:val="0"/>
+          <w:numId w:val="30"/>
+        </w:numPr>
+        <w:rPr>
+          <w:sz w:val="22"/>
+          <w:szCs w:val="22"/>
+        </w:rPr>
+      </w:pPr>
+      <w:r>
+        <w:rPr>
+          <w:sz w:val="22"/>
+          <w:szCs w:val="22"/>
+        </w:rPr>
+        <w:t>Engauge in continual improvement of security and functional aspects.</w:t>
       </w:r>
     </w:p>
     <w:p>
@@ -3115,14 +3371,7 @@
               <w:rPr>
                 <w:color w:val="FFFFFF" w:themeColor="background1"/>
               </w:rPr>
-              <w:t xml:space="preserve"> (Days after an </w:t>
-            </w:r>
-            <w:r>
-              <w:rPr>
-                <w:color w:val="FFFFFF" w:themeColor="background1"/>
-              </w:rPr>
-              <w:lastRenderedPageBreak/>
-              <w:t>agreement is accepted)</w:t>
+              <w:t xml:space="preserve"> (Days after an agreement is accepted)</w:t>
             </w:r>
           </w:p>
         </w:tc>
@@ -3138,7 +3387,6 @@
               <w:jc w:val="center"/>
             </w:pPr>
             <w:r>
-              <w:lastRenderedPageBreak/>
               <w:t>1.</w:t>
             </w:r>
           </w:p>
@@ -3510,6 +3758,7 @@
           <w:sz w:val="22"/>
           <w:szCs w:val="22"/>
         </w:rPr>
+        <w:lastRenderedPageBreak/>
         <w:t xml:space="preserve">Control access to features based on roles and permissions for the company’s users, both on and </w:t>
       </w:r>
       <w:r>
@@ -3599,6 +3848,20 @@
         </w:rPr>
         <w:t xml:space="preserve">Can be enhanced and scaled </w:t>
       </w:r>
+    </w:p>
+    <w:p>
+      <w:r>
+        <w:t>The system provided will not fulfill the following items</w:t>
+      </w:r>
+    </w:p>
+    <w:p>
+      <w:pPr>
+        <w:pStyle w:val="ListParagraph"/>
+        <w:numPr>
+          <w:ilvl w:val="0"/>
+          <w:numId w:val="31"/>
+        </w:numPr>
+      </w:pPr>
     </w:p>
     <w:p>
       <w:pPr>
@@ -8176,6 +8439,95 @@
     </w:lvl>
   </w:abstractNum>
   <w:abstractNum w:abstractNumId="3" w15:restartNumberingAfterBreak="0">
+    <w:nsid w:val="097747EA"/>
+    <w:multiLevelType w:val="hybridMultilevel"/>
+    <w:tmpl w:val="2B7C83E8"/>
+    <w:lvl w:ilvl="0" w:tplc="0409000F">
+      <w:start w:val="1"/>
+      <w:numFmt w:val="decimal"/>
+      <w:lvlText w:val="%1."/>
+      <w:lvlJc w:val="left"/>
+      <w:pPr>
+        <w:ind w:left="720" w:hanging="360"/>
+      </w:pPr>
+      <w:rPr>
+        <w:rFonts w:hint="default"/>
+      </w:rPr>
+    </w:lvl>
+    <w:lvl w:ilvl="1" w:tplc="04090019" w:tentative="1">
+      <w:start w:val="1"/>
+      <w:numFmt w:val="lowerLetter"/>
+      <w:lvlText w:val="%2."/>
+      <w:lvlJc w:val="left"/>
+      <w:pPr>
+        <w:ind w:left="1440" w:hanging="360"/>
+      </w:pPr>
+    </w:lvl>
+    <w:lvl w:ilvl="2" w:tplc="0409001B" w:tentative="1">
+      <w:start w:val="1"/>
+      <w:numFmt w:val="lowerRoman"/>
+      <w:lvlText w:val="%3."/>
+      <w:lvlJc w:val="right"/>
+      <w:pPr>
+        <w:ind w:left="2160" w:hanging="180"/>
+      </w:pPr>
+    </w:lvl>
+    <w:lvl w:ilvl="3" w:tplc="0409000F" w:tentative="1">
+      <w:start w:val="1"/>
+      <w:numFmt w:val="decimal"/>
+      <w:lvlText w:val="%4."/>
+      <w:lvlJc w:val="left"/>
+      <w:pPr>
+        <w:ind w:left="2880" w:hanging="360"/>
+      </w:pPr>
+    </w:lvl>
+    <w:lvl w:ilvl="4" w:tplc="04090019" w:tentative="1">
+      <w:start w:val="1"/>
+      <w:numFmt w:val="lowerLetter"/>
+      <w:lvlText w:val="%5."/>
+      <w:lvlJc w:val="left"/>
+      <w:pPr>
+        <w:ind w:left="3600" w:hanging="360"/>
+      </w:pPr>
+    </w:lvl>
+    <w:lvl w:ilvl="5" w:tplc="0409001B" w:tentative="1">
+      <w:start w:val="1"/>
+      <w:numFmt w:val="lowerRoman"/>
+      <w:lvlText w:val="%6."/>
+      <w:lvlJc w:val="right"/>
+      <w:pPr>
+        <w:ind w:left="4320" w:hanging="180"/>
+      </w:pPr>
+    </w:lvl>
+    <w:lvl w:ilvl="6" w:tplc="0409000F" w:tentative="1">
+      <w:start w:val="1"/>
+      <w:numFmt w:val="decimal"/>
+      <w:lvlText w:val="%7."/>
+      <w:lvlJc w:val="left"/>
+      <w:pPr>
+        <w:ind w:left="5040" w:hanging="360"/>
+      </w:pPr>
+    </w:lvl>
+    <w:lvl w:ilvl="7" w:tplc="04090019" w:tentative="1">
+      <w:start w:val="1"/>
+      <w:numFmt w:val="lowerLetter"/>
+      <w:lvlText w:val="%8."/>
+      <w:lvlJc w:val="left"/>
+      <w:pPr>
+        <w:ind w:left="5760" w:hanging="360"/>
+      </w:pPr>
+    </w:lvl>
+    <w:lvl w:ilvl="8" w:tplc="0409001B" w:tentative="1">
+      <w:start w:val="1"/>
+      <w:numFmt w:val="lowerRoman"/>
+      <w:lvlText w:val="%9."/>
+      <w:lvlJc w:val="right"/>
+      <w:pPr>
+        <w:ind w:left="6480" w:hanging="180"/>
+      </w:pPr>
+    </w:lvl>
+  </w:abstractNum>
+  <w:abstractNum w:abstractNumId="4" w15:restartNumberingAfterBreak="0">
     <w:nsid w:val="119D5481"/>
     <w:multiLevelType w:val="hybridMultilevel"/>
     <w:tmpl w:val="5C3282BC"/>
@@ -8264,7 +8616,7 @@
       </w:pPr>
     </w:lvl>
   </w:abstractNum>
-  <w:abstractNum w:abstractNumId="4" w15:restartNumberingAfterBreak="0">
+  <w:abstractNum w:abstractNumId="5" w15:restartNumberingAfterBreak="0">
     <w:nsid w:val="163E70E7"/>
     <w:multiLevelType w:val="hybridMultilevel"/>
     <w:tmpl w:val="960A7992"/>
@@ -8353,7 +8705,7 @@
       </w:pPr>
     </w:lvl>
   </w:abstractNum>
-  <w:abstractNum w:abstractNumId="5" w15:restartNumberingAfterBreak="0">
+  <w:abstractNum w:abstractNumId="6" w15:restartNumberingAfterBreak="0">
     <w:nsid w:val="1C2865F9"/>
     <w:multiLevelType w:val="hybridMultilevel"/>
     <w:tmpl w:val="22DE047E"/>
@@ -8442,7 +8794,7 @@
       </w:pPr>
     </w:lvl>
   </w:abstractNum>
-  <w:abstractNum w:abstractNumId="6" w15:restartNumberingAfterBreak="0">
+  <w:abstractNum w:abstractNumId="7" w15:restartNumberingAfterBreak="0">
     <w:nsid w:val="1CC85F5E"/>
     <w:multiLevelType w:val="hybridMultilevel"/>
     <w:tmpl w:val="BD341E10"/>
@@ -8555,7 +8907,7 @@
       </w:rPr>
     </w:lvl>
   </w:abstractNum>
-  <w:abstractNum w:abstractNumId="7" w15:restartNumberingAfterBreak="0">
+  <w:abstractNum w:abstractNumId="8" w15:restartNumberingAfterBreak="0">
     <w:nsid w:val="1EB25771"/>
     <w:multiLevelType w:val="hybridMultilevel"/>
     <w:tmpl w:val="9A46DD80"/>
@@ -8668,7 +9020,7 @@
       </w:rPr>
     </w:lvl>
   </w:abstractNum>
-  <w:abstractNum w:abstractNumId="8" w15:restartNumberingAfterBreak="0">
+  <w:abstractNum w:abstractNumId="9" w15:restartNumberingAfterBreak="0">
     <w:nsid w:val="232B513A"/>
     <w:multiLevelType w:val="hybridMultilevel"/>
     <w:tmpl w:val="EA58BB18"/>
@@ -8781,7 +9133,7 @@
       </w:rPr>
     </w:lvl>
   </w:abstractNum>
-  <w:abstractNum w:abstractNumId="9" w15:restartNumberingAfterBreak="0">
+  <w:abstractNum w:abstractNumId="10" w15:restartNumberingAfterBreak="0">
     <w:nsid w:val="2D414129"/>
     <w:multiLevelType w:val="hybridMultilevel"/>
     <w:tmpl w:val="C3B219C2"/>
@@ -8894,7 +9246,7 @@
       </w:rPr>
     </w:lvl>
   </w:abstractNum>
-  <w:abstractNum w:abstractNumId="10" w15:restartNumberingAfterBreak="0">
+  <w:abstractNum w:abstractNumId="11" w15:restartNumberingAfterBreak="0">
     <w:nsid w:val="3C7B7433"/>
     <w:multiLevelType w:val="hybridMultilevel"/>
     <w:tmpl w:val="3B22E13A"/>
@@ -9007,7 +9359,7 @@
       </w:rPr>
     </w:lvl>
   </w:abstractNum>
-  <w:abstractNum w:abstractNumId="11" w15:restartNumberingAfterBreak="0">
+  <w:abstractNum w:abstractNumId="12" w15:restartNumberingAfterBreak="0">
     <w:nsid w:val="413146A0"/>
     <w:multiLevelType w:val="hybridMultilevel"/>
     <w:tmpl w:val="C3B219C2"/>
@@ -9120,7 +9472,7 @@
       </w:rPr>
     </w:lvl>
   </w:abstractNum>
-  <w:abstractNum w:abstractNumId="12" w15:restartNumberingAfterBreak="0">
+  <w:abstractNum w:abstractNumId="13" w15:restartNumberingAfterBreak="0">
     <w:nsid w:val="435F48A1"/>
     <w:multiLevelType w:val="hybridMultilevel"/>
     <w:tmpl w:val="ABC07A2A"/>
@@ -9209,7 +9561,7 @@
       </w:pPr>
     </w:lvl>
   </w:abstractNum>
-  <w:abstractNum w:abstractNumId="13" w15:restartNumberingAfterBreak="0">
+  <w:abstractNum w:abstractNumId="14" w15:restartNumberingAfterBreak="0">
     <w:nsid w:val="523174DB"/>
     <w:multiLevelType w:val="multilevel"/>
     <w:tmpl w:val="2E9A22F2"/>
@@ -9295,7 +9647,7 @@
       </w:pPr>
     </w:lvl>
   </w:abstractNum>
-  <w:abstractNum w:abstractNumId="14" w15:restartNumberingAfterBreak="0">
+  <w:abstractNum w:abstractNumId="15" w15:restartNumberingAfterBreak="0">
     <w:nsid w:val="534C4CB1"/>
     <w:multiLevelType w:val="multilevel"/>
     <w:tmpl w:val="0409001F"/>
@@ -9381,7 +9733,7 @@
       </w:pPr>
     </w:lvl>
   </w:abstractNum>
-  <w:abstractNum w:abstractNumId="15" w15:restartNumberingAfterBreak="0">
+  <w:abstractNum w:abstractNumId="16" w15:restartNumberingAfterBreak="0">
     <w:nsid w:val="57D6721D"/>
     <w:multiLevelType w:val="hybridMultilevel"/>
     <w:tmpl w:val="42D2F6A8"/>
@@ -9470,7 +9822,7 @@
       </w:pPr>
     </w:lvl>
   </w:abstractNum>
-  <w:abstractNum w:abstractNumId="16" w15:restartNumberingAfterBreak="0">
+  <w:abstractNum w:abstractNumId="17" w15:restartNumberingAfterBreak="0">
     <w:nsid w:val="57D963FF"/>
     <w:multiLevelType w:val="hybridMultilevel"/>
     <w:tmpl w:val="00A04422"/>
@@ -9583,7 +9935,7 @@
       </w:rPr>
     </w:lvl>
   </w:abstractNum>
-  <w:abstractNum w:abstractNumId="17" w15:restartNumberingAfterBreak="0">
+  <w:abstractNum w:abstractNumId="18" w15:restartNumberingAfterBreak="0">
     <w:nsid w:val="5A6F104C"/>
     <w:multiLevelType w:val="hybridMultilevel"/>
     <w:tmpl w:val="B454895A"/>
@@ -9696,7 +10048,7 @@
       </w:rPr>
     </w:lvl>
   </w:abstractNum>
-  <w:abstractNum w:abstractNumId="18" w15:restartNumberingAfterBreak="0">
+  <w:abstractNum w:abstractNumId="19" w15:restartNumberingAfterBreak="0">
     <w:nsid w:val="5A874009"/>
     <w:multiLevelType w:val="hybridMultilevel"/>
     <w:tmpl w:val="26444DDA"/>
@@ -9785,7 +10137,120 @@
       </w:pPr>
     </w:lvl>
   </w:abstractNum>
-  <w:abstractNum w:abstractNumId="19" w15:restartNumberingAfterBreak="0">
+  <w:abstractNum w:abstractNumId="20" w15:restartNumberingAfterBreak="0">
+    <w:nsid w:val="61EF5270"/>
+    <w:multiLevelType w:val="hybridMultilevel"/>
+    <w:tmpl w:val="ABCC314E"/>
+    <w:lvl w:ilvl="0" w:tplc="04090001">
+      <w:start w:val="1"/>
+      <w:numFmt w:val="bullet"/>
+      <w:lvlText w:val=""/>
+      <w:lvlJc w:val="left"/>
+      <w:pPr>
+        <w:ind w:left="720" w:hanging="360"/>
+      </w:pPr>
+      <w:rPr>
+        <w:rFonts w:ascii="Symbol" w:hAnsi="Symbol" w:hint="default"/>
+      </w:rPr>
+    </w:lvl>
+    <w:lvl w:ilvl="1" w:tplc="04090003" w:tentative="1">
+      <w:start w:val="1"/>
+      <w:numFmt w:val="bullet"/>
+      <w:lvlText w:val="o"/>
+      <w:lvlJc w:val="left"/>
+      <w:pPr>
+        <w:ind w:left="1440" w:hanging="360"/>
+      </w:pPr>
+      <w:rPr>
+        <w:rFonts w:ascii="Courier New" w:hAnsi="Courier New" w:cs="Courier New" w:hint="default"/>
+      </w:rPr>
+    </w:lvl>
+    <w:lvl w:ilvl="2" w:tplc="04090005" w:tentative="1">
+      <w:start w:val="1"/>
+      <w:numFmt w:val="bullet"/>
+      <w:lvlText w:val=""/>
+      <w:lvlJc w:val="left"/>
+      <w:pPr>
+        <w:ind w:left="2160" w:hanging="360"/>
+      </w:pPr>
+      <w:rPr>
+        <w:rFonts w:ascii="Wingdings" w:hAnsi="Wingdings" w:hint="default"/>
+      </w:rPr>
+    </w:lvl>
+    <w:lvl w:ilvl="3" w:tplc="04090001" w:tentative="1">
+      <w:start w:val="1"/>
+      <w:numFmt w:val="bullet"/>
+      <w:lvlText w:val=""/>
+      <w:lvlJc w:val="left"/>
+      <w:pPr>
+        <w:ind w:left="2880" w:hanging="360"/>
+      </w:pPr>
+      <w:rPr>
+        <w:rFonts w:ascii="Symbol" w:hAnsi="Symbol" w:hint="default"/>
+      </w:rPr>
+    </w:lvl>
+    <w:lvl w:ilvl="4" w:tplc="04090003" w:tentative="1">
+      <w:start w:val="1"/>
+      <w:numFmt w:val="bullet"/>
+      <w:lvlText w:val="o"/>
+      <w:lvlJc w:val="left"/>
+      <w:pPr>
+        <w:ind w:left="3600" w:hanging="360"/>
+      </w:pPr>
+      <w:rPr>
+        <w:rFonts w:ascii="Courier New" w:hAnsi="Courier New" w:cs="Courier New" w:hint="default"/>
+      </w:rPr>
+    </w:lvl>
+    <w:lvl w:ilvl="5" w:tplc="04090005" w:tentative="1">
+      <w:start w:val="1"/>
+      <w:numFmt w:val="bullet"/>
+      <w:lvlText w:val=""/>
+      <w:lvlJc w:val="left"/>
+      <w:pPr>
+        <w:ind w:left="4320" w:hanging="360"/>
+      </w:pPr>
+      <w:rPr>
+        <w:rFonts w:ascii="Wingdings" w:hAnsi="Wingdings" w:hint="default"/>
+      </w:rPr>
+    </w:lvl>
+    <w:lvl w:ilvl="6" w:tplc="04090001" w:tentative="1">
+      <w:start w:val="1"/>
+      <w:numFmt w:val="bullet"/>
+      <w:lvlText w:val=""/>
+      <w:lvlJc w:val="left"/>
+      <w:pPr>
+        <w:ind w:left="5040" w:hanging="360"/>
+      </w:pPr>
+      <w:rPr>
+        <w:rFonts w:ascii="Symbol" w:hAnsi="Symbol" w:hint="default"/>
+      </w:rPr>
+    </w:lvl>
+    <w:lvl w:ilvl="7" w:tplc="04090003" w:tentative="1">
+      <w:start w:val="1"/>
+      <w:numFmt w:val="bullet"/>
+      <w:lvlText w:val="o"/>
+      <w:lvlJc w:val="left"/>
+      <w:pPr>
+        <w:ind w:left="5760" w:hanging="360"/>
+      </w:pPr>
+      <w:rPr>
+        <w:rFonts w:ascii="Courier New" w:hAnsi="Courier New" w:cs="Courier New" w:hint="default"/>
+      </w:rPr>
+    </w:lvl>
+    <w:lvl w:ilvl="8" w:tplc="04090005" w:tentative="1">
+      <w:start w:val="1"/>
+      <w:numFmt w:val="bullet"/>
+      <w:lvlText w:val=""/>
+      <w:lvlJc w:val="left"/>
+      <w:pPr>
+        <w:ind w:left="6480" w:hanging="360"/>
+      </w:pPr>
+      <w:rPr>
+        <w:rFonts w:ascii="Wingdings" w:hAnsi="Wingdings" w:hint="default"/>
+      </w:rPr>
+    </w:lvl>
+  </w:abstractNum>
+  <w:abstractNum w:abstractNumId="21" w15:restartNumberingAfterBreak="0">
     <w:nsid w:val="625351D4"/>
     <w:multiLevelType w:val="hybridMultilevel"/>
     <w:tmpl w:val="FFE8EE26"/>
@@ -9898,7 +10363,7 @@
       </w:rPr>
     </w:lvl>
   </w:abstractNum>
-  <w:abstractNum w:abstractNumId="20" w15:restartNumberingAfterBreak="0">
+  <w:abstractNum w:abstractNumId="22" w15:restartNumberingAfterBreak="0">
     <w:nsid w:val="62B57B86"/>
     <w:multiLevelType w:val="hybridMultilevel"/>
     <w:tmpl w:val="08BC658C"/>
@@ -10011,7 +10476,7 @@
       </w:rPr>
     </w:lvl>
   </w:abstractNum>
-  <w:abstractNum w:abstractNumId="21" w15:restartNumberingAfterBreak="0">
+  <w:abstractNum w:abstractNumId="23" w15:restartNumberingAfterBreak="0">
     <w:nsid w:val="63353E17"/>
     <w:multiLevelType w:val="multilevel"/>
     <w:tmpl w:val="2E9A22F2"/>
@@ -10097,7 +10562,7 @@
       </w:pPr>
     </w:lvl>
   </w:abstractNum>
-  <w:abstractNum w:abstractNumId="22" w15:restartNumberingAfterBreak="0">
+  <w:abstractNum w:abstractNumId="24" w15:restartNumberingAfterBreak="0">
     <w:nsid w:val="6C0A7A9E"/>
     <w:multiLevelType w:val="hybridMultilevel"/>
     <w:tmpl w:val="AB4893CA"/>
@@ -10210,7 +10675,7 @@
       </w:rPr>
     </w:lvl>
   </w:abstractNum>
-  <w:abstractNum w:abstractNumId="23" w15:restartNumberingAfterBreak="0">
+  <w:abstractNum w:abstractNumId="25" w15:restartNumberingAfterBreak="0">
     <w:nsid w:val="6D06502E"/>
     <w:multiLevelType w:val="hybridMultilevel"/>
     <w:tmpl w:val="C3B219C2"/>
@@ -10323,7 +10788,7 @@
       </w:rPr>
     </w:lvl>
   </w:abstractNum>
-  <w:abstractNum w:abstractNumId="24" w15:restartNumberingAfterBreak="0">
+  <w:abstractNum w:abstractNumId="26" w15:restartNumberingAfterBreak="0">
     <w:nsid w:val="6D7D24AA"/>
     <w:multiLevelType w:val="hybridMultilevel"/>
     <w:tmpl w:val="7A765E4E"/>
@@ -10436,7 +10901,7 @@
       </w:rPr>
     </w:lvl>
   </w:abstractNum>
-  <w:abstractNum w:abstractNumId="25" w15:restartNumberingAfterBreak="0">
+  <w:abstractNum w:abstractNumId="27" w15:restartNumberingAfterBreak="0">
     <w:nsid w:val="744B3713"/>
     <w:multiLevelType w:val="hybridMultilevel"/>
     <w:tmpl w:val="1B1A1F18"/>
@@ -10446,7 +10911,7 @@
       <w:lvlText w:val=""/>
       <w:lvlJc w:val="left"/>
       <w:pPr>
-        <w:ind w:left="1440" w:hanging="360"/>
+        <w:ind w:left="720" w:hanging="360"/>
       </w:pPr>
       <w:rPr>
         <w:rFonts w:ascii="Symbol" w:hAnsi="Symbol" w:hint="default"/>
@@ -10458,7 +10923,7 @@
       <w:lvlText w:val="o"/>
       <w:lvlJc w:val="left"/>
       <w:pPr>
-        <w:ind w:left="2160" w:hanging="360"/>
+        <w:ind w:left="1440" w:hanging="360"/>
       </w:pPr>
       <w:rPr>
         <w:rFonts w:ascii="Courier New" w:hAnsi="Courier New" w:cs="Courier New" w:hint="default"/>
@@ -10470,7 +10935,7 @@
       <w:lvlText w:val=""/>
       <w:lvlJc w:val="left"/>
       <w:pPr>
-        <w:ind w:left="2880" w:hanging="360"/>
+        <w:ind w:left="2160" w:hanging="360"/>
       </w:pPr>
       <w:rPr>
         <w:rFonts w:ascii="Wingdings" w:hAnsi="Wingdings" w:hint="default"/>
@@ -10482,7 +10947,7 @@
       <w:lvlText w:val=""/>
       <w:lvlJc w:val="left"/>
       <w:pPr>
-        <w:ind w:left="3600" w:hanging="360"/>
+        <w:ind w:left="2880" w:hanging="360"/>
       </w:pPr>
       <w:rPr>
         <w:rFonts w:ascii="Symbol" w:hAnsi="Symbol" w:hint="default"/>
@@ -10494,7 +10959,7 @@
       <w:lvlText w:val="o"/>
       <w:lvlJc w:val="left"/>
       <w:pPr>
-        <w:ind w:left="4320" w:hanging="360"/>
+        <w:ind w:left="3600" w:hanging="360"/>
       </w:pPr>
       <w:rPr>
         <w:rFonts w:ascii="Courier New" w:hAnsi="Courier New" w:cs="Courier New" w:hint="default"/>
@@ -10506,7 +10971,7 @@
       <w:lvlText w:val=""/>
       <w:lvlJc w:val="left"/>
       <w:pPr>
-        <w:ind w:left="5040" w:hanging="360"/>
+        <w:ind w:left="4320" w:hanging="360"/>
       </w:pPr>
       <w:rPr>
         <w:rFonts w:ascii="Wingdings" w:hAnsi="Wingdings" w:hint="default"/>
@@ -10518,7 +10983,7 @@
       <w:lvlText w:val=""/>
       <w:lvlJc w:val="left"/>
       <w:pPr>
-        <w:ind w:left="5760" w:hanging="360"/>
+        <w:ind w:left="5040" w:hanging="360"/>
       </w:pPr>
       <w:rPr>
         <w:rFonts w:ascii="Symbol" w:hAnsi="Symbol" w:hint="default"/>
@@ -10530,7 +10995,7 @@
       <w:lvlText w:val="o"/>
       <w:lvlJc w:val="left"/>
       <w:pPr>
-        <w:ind w:left="6480" w:hanging="360"/>
+        <w:ind w:left="5760" w:hanging="360"/>
       </w:pPr>
       <w:rPr>
         <w:rFonts w:ascii="Courier New" w:hAnsi="Courier New" w:cs="Courier New" w:hint="default"/>
@@ -10542,14 +11007,14 @@
       <w:lvlText w:val=""/>
       <w:lvlJc w:val="left"/>
       <w:pPr>
-        <w:ind w:left="7200" w:hanging="360"/>
+        <w:ind w:left="6480" w:hanging="360"/>
       </w:pPr>
       <w:rPr>
         <w:rFonts w:ascii="Wingdings" w:hAnsi="Wingdings" w:hint="default"/>
       </w:rPr>
     </w:lvl>
   </w:abstractNum>
-  <w:abstractNum w:abstractNumId="26" w15:restartNumberingAfterBreak="0">
+  <w:abstractNum w:abstractNumId="28" w15:restartNumberingAfterBreak="0">
     <w:nsid w:val="7789161A"/>
     <w:multiLevelType w:val="hybridMultilevel"/>
     <w:tmpl w:val="4BB6F6CA"/>
@@ -10638,7 +11103,7 @@
       </w:pPr>
     </w:lvl>
   </w:abstractNum>
-  <w:abstractNum w:abstractNumId="27" w15:restartNumberingAfterBreak="0">
+  <w:abstractNum w:abstractNumId="29" w15:restartNumberingAfterBreak="0">
     <w:nsid w:val="796B4CEE"/>
     <w:multiLevelType w:val="hybridMultilevel"/>
     <w:tmpl w:val="02C229AE"/>
@@ -10727,44 +11192,133 @@
       </w:pPr>
     </w:lvl>
   </w:abstractNum>
+  <w:abstractNum w:abstractNumId="30" w15:restartNumberingAfterBreak="0">
+    <w:nsid w:val="7E4F5E8D"/>
+    <w:multiLevelType w:val="hybridMultilevel"/>
+    <w:tmpl w:val="C1A0D15C"/>
+    <w:lvl w:ilvl="0" w:tplc="0409000F">
+      <w:start w:val="1"/>
+      <w:numFmt w:val="decimal"/>
+      <w:lvlText w:val="%1."/>
+      <w:lvlJc w:val="left"/>
+      <w:pPr>
+        <w:ind w:left="720" w:hanging="360"/>
+      </w:pPr>
+      <w:rPr>
+        <w:rFonts w:hint="default"/>
+      </w:rPr>
+    </w:lvl>
+    <w:lvl w:ilvl="1" w:tplc="04090019" w:tentative="1">
+      <w:start w:val="1"/>
+      <w:numFmt w:val="lowerLetter"/>
+      <w:lvlText w:val="%2."/>
+      <w:lvlJc w:val="left"/>
+      <w:pPr>
+        <w:ind w:left="1440" w:hanging="360"/>
+      </w:pPr>
+    </w:lvl>
+    <w:lvl w:ilvl="2" w:tplc="0409001B" w:tentative="1">
+      <w:start w:val="1"/>
+      <w:numFmt w:val="lowerRoman"/>
+      <w:lvlText w:val="%3."/>
+      <w:lvlJc w:val="right"/>
+      <w:pPr>
+        <w:ind w:left="2160" w:hanging="180"/>
+      </w:pPr>
+    </w:lvl>
+    <w:lvl w:ilvl="3" w:tplc="0409000F" w:tentative="1">
+      <w:start w:val="1"/>
+      <w:numFmt w:val="decimal"/>
+      <w:lvlText w:val="%4."/>
+      <w:lvlJc w:val="left"/>
+      <w:pPr>
+        <w:ind w:left="2880" w:hanging="360"/>
+      </w:pPr>
+    </w:lvl>
+    <w:lvl w:ilvl="4" w:tplc="04090019" w:tentative="1">
+      <w:start w:val="1"/>
+      <w:numFmt w:val="lowerLetter"/>
+      <w:lvlText w:val="%5."/>
+      <w:lvlJc w:val="left"/>
+      <w:pPr>
+        <w:ind w:left="3600" w:hanging="360"/>
+      </w:pPr>
+    </w:lvl>
+    <w:lvl w:ilvl="5" w:tplc="0409001B" w:tentative="1">
+      <w:start w:val="1"/>
+      <w:numFmt w:val="lowerRoman"/>
+      <w:lvlText w:val="%6."/>
+      <w:lvlJc w:val="right"/>
+      <w:pPr>
+        <w:ind w:left="4320" w:hanging="180"/>
+      </w:pPr>
+    </w:lvl>
+    <w:lvl w:ilvl="6" w:tplc="0409000F" w:tentative="1">
+      <w:start w:val="1"/>
+      <w:numFmt w:val="decimal"/>
+      <w:lvlText w:val="%7."/>
+      <w:lvlJc w:val="left"/>
+      <w:pPr>
+        <w:ind w:left="5040" w:hanging="360"/>
+      </w:pPr>
+    </w:lvl>
+    <w:lvl w:ilvl="7" w:tplc="04090019" w:tentative="1">
+      <w:start w:val="1"/>
+      <w:numFmt w:val="lowerLetter"/>
+      <w:lvlText w:val="%8."/>
+      <w:lvlJc w:val="left"/>
+      <w:pPr>
+        <w:ind w:left="5760" w:hanging="360"/>
+      </w:pPr>
+    </w:lvl>
+    <w:lvl w:ilvl="8" w:tplc="0409001B" w:tentative="1">
+      <w:start w:val="1"/>
+      <w:numFmt w:val="lowerRoman"/>
+      <w:lvlText w:val="%9."/>
+      <w:lvlJc w:val="right"/>
+      <w:pPr>
+        <w:ind w:left="6480" w:hanging="180"/>
+      </w:pPr>
+    </w:lvl>
+  </w:abstractNum>
   <w:num w:numId="1" w16cid:durableId="531962245">
-    <w:abstractNumId w:val="13"/>
+    <w:abstractNumId w:val="14"/>
   </w:num>
   <w:num w:numId="2" w16cid:durableId="1342657301">
-    <w:abstractNumId w:val="14"/>
+    <w:abstractNumId w:val="15"/>
   </w:num>
   <w:num w:numId="3" w16cid:durableId="1027675712">
+    <w:abstractNumId w:val="12"/>
+  </w:num>
+  <w:num w:numId="4" w16cid:durableId="655189614">
+    <w:abstractNumId w:val="25"/>
+  </w:num>
+  <w:num w:numId="5" w16cid:durableId="210118218">
+    <w:abstractNumId w:val="10"/>
+  </w:num>
+  <w:num w:numId="6" w16cid:durableId="602567145">
+    <w:abstractNumId w:val="23"/>
+  </w:num>
+  <w:num w:numId="7" w16cid:durableId="473764808">
+    <w:abstractNumId w:val="19"/>
+  </w:num>
+  <w:num w:numId="8" w16cid:durableId="455952919">
+    <w:abstractNumId w:val="6"/>
+  </w:num>
+  <w:num w:numId="9" w16cid:durableId="194318713">
+    <w:abstractNumId w:val="27"/>
+  </w:num>
+  <w:num w:numId="10" w16cid:durableId="1693800149">
+    <w:abstractNumId w:val="26"/>
+  </w:num>
+  <w:num w:numId="11" w16cid:durableId="340162927">
+    <w:abstractNumId w:val="18"/>
+  </w:num>
+  <w:num w:numId="12" w16cid:durableId="1581207348">
     <w:abstractNumId w:val="11"/>
   </w:num>
-  <w:num w:numId="4" w16cid:durableId="655189614">
-    <w:abstractNumId w:val="23"/>
-  </w:num>
-  <w:num w:numId="5" w16cid:durableId="210118218">
-    <w:abstractNumId w:val="9"/>
-  </w:num>
-  <w:num w:numId="6" w16cid:durableId="602567145">
+  <w:num w:numId="13" w16cid:durableId="329260803">
     <w:abstractNumId w:val="21"/>
-  </w:num>
-  <w:num w:numId="7" w16cid:durableId="473764808">
-    <w:abstractNumId w:val="18"/>
-  </w:num>
-  <w:num w:numId="8" w16cid:durableId="455952919">
-    <w:abstractNumId w:val="5"/>
-  </w:num>
-  <w:num w:numId="9" w16cid:durableId="194318713">
-    <w:abstractNumId w:val="25"/>
-  </w:num>
-  <w:num w:numId="10" w16cid:durableId="1693800149">
-    <w:abstractNumId w:val="24"/>
-  </w:num>
-  <w:num w:numId="11" w16cid:durableId="340162927">
-    <w:abstractNumId w:val="17"/>
-  </w:num>
-  <w:num w:numId="12" w16cid:durableId="1581207348">
-    <w:abstractNumId w:val="10"/>
-  </w:num>
-  <w:num w:numId="13" w16cid:durableId="329260803">
-    <w:abstractNumId w:val="19"/>
   </w:num>
   <w:num w:numId="14" w16cid:durableId="1139616560">
     <w:abstractNumId w:val="2"/>
@@ -10773,43 +11327,52 @@
     <w:abstractNumId w:val="0"/>
   </w:num>
   <w:num w:numId="16" w16cid:durableId="822702858">
-    <w:abstractNumId w:val="6"/>
+    <w:abstractNumId w:val="7"/>
   </w:num>
   <w:num w:numId="17" w16cid:durableId="1239750305">
-    <w:abstractNumId w:val="20"/>
+    <w:abstractNumId w:val="22"/>
   </w:num>
   <w:num w:numId="18" w16cid:durableId="365133427">
-    <w:abstractNumId w:val="16"/>
+    <w:abstractNumId w:val="17"/>
   </w:num>
   <w:num w:numId="19" w16cid:durableId="581260906">
-    <w:abstractNumId w:val="22"/>
+    <w:abstractNumId w:val="24"/>
   </w:num>
   <w:num w:numId="20" w16cid:durableId="1758550325">
     <w:abstractNumId w:val="1"/>
   </w:num>
   <w:num w:numId="21" w16cid:durableId="1594894255">
-    <w:abstractNumId w:val="7"/>
+    <w:abstractNumId w:val="8"/>
   </w:num>
   <w:num w:numId="22" w16cid:durableId="977876665">
-    <w:abstractNumId w:val="8"/>
+    <w:abstractNumId w:val="9"/>
   </w:num>
   <w:num w:numId="23" w16cid:durableId="1596402915">
-    <w:abstractNumId w:val="27"/>
+    <w:abstractNumId w:val="29"/>
   </w:num>
   <w:num w:numId="24" w16cid:durableId="1183395283">
-    <w:abstractNumId w:val="26"/>
+    <w:abstractNumId w:val="28"/>
   </w:num>
   <w:num w:numId="25" w16cid:durableId="1108815011">
+    <w:abstractNumId w:val="4"/>
+  </w:num>
+  <w:num w:numId="26" w16cid:durableId="238171851">
+    <w:abstractNumId w:val="13"/>
+  </w:num>
+  <w:num w:numId="27" w16cid:durableId="1032341646">
+    <w:abstractNumId w:val="16"/>
+  </w:num>
+  <w:num w:numId="28" w16cid:durableId="295529253">
+    <w:abstractNumId w:val="5"/>
+  </w:num>
+  <w:num w:numId="29" w16cid:durableId="522980538">
+    <w:abstractNumId w:val="30"/>
+  </w:num>
+  <w:num w:numId="30" w16cid:durableId="191959371">
     <w:abstractNumId w:val="3"/>
   </w:num>
-  <w:num w:numId="26" w16cid:durableId="238171851">
-    <w:abstractNumId w:val="12"/>
-  </w:num>
-  <w:num w:numId="27" w16cid:durableId="1032341646">
-    <w:abstractNumId w:val="15"/>
-  </w:num>
-  <w:num w:numId="28" w16cid:durableId="295529253">
-    <w:abstractNumId w:val="4"/>
+  <w:num w:numId="31" w16cid:durableId="68188470">
+    <w:abstractNumId w:val="20"/>
   </w:num>
 </w:numbering>
 </file>
@@ -11888,6 +12451,7 @@
     <w:rsid w:val="002E77B7"/>
     <w:rsid w:val="002F4536"/>
     <w:rsid w:val="00374944"/>
+    <w:rsid w:val="004639C5"/>
     <w:rsid w:val="0047202C"/>
     <w:rsid w:val="004E4522"/>
     <w:rsid w:val="006B13B5"/>
@@ -11896,6 +12460,7 @@
     <w:rsid w:val="009D2E3B"/>
     <w:rsid w:val="009F07B5"/>
     <w:rsid w:val="009F66F6"/>
+    <w:rsid w:val="00A54436"/>
     <w:rsid w:val="00A82CD5"/>
     <w:rsid w:val="00A86E70"/>
     <w:rsid w:val="00A9089F"/>
@@ -11904,6 +12469,7 @@
     <w:rsid w:val="00C939B0"/>
     <w:rsid w:val="00D36A91"/>
     <w:rsid w:val="00D52881"/>
+    <w:rsid w:val="00EE1572"/>
     <w:rsid w:val="00F42FC0"/>
   </w:rsids>
   <m:mathPr>
@@ -12652,6 +13218,10 @@
 </file>
 
 <file path=customXml/item2.xml><?xml version="1.0" encoding="utf-8"?>
+<b:Sources xmlns:b="http://schemas.openxmlformats.org/officeDocument/2006/bibliography" xmlns="http://schemas.openxmlformats.org/officeDocument/2006/bibliography" SelectedStyle="\APASixthEditionOfficeOnline.xsl" StyleName="APA" Version="6"/>
+</file>
+
+<file path=customXml/item3.xml><?xml version="1.0" encoding="utf-8"?>
 <ct:contentTypeSchema xmlns:ct="http://schemas.microsoft.com/office/2006/metadata/contentType" xmlns:ma="http://schemas.microsoft.com/office/2006/metadata/properties/metaAttributes" ct:_="" ma:_="" ma:contentTypeName="Document" ma:contentTypeID="0x010100C39F2A75005F2D43B30369DAED2CCB1C" ma:contentTypeVersion="45" ma:contentTypeDescription="Create a new document." ma:contentTypeScope="" ma:versionID="1b9fdb374581140854a9d0518901e886">
   <xsd:schema xmlns:xsd="http://www.w3.org/2001/XMLSchema" xmlns:xs="http://www.w3.org/2001/XMLSchema" xmlns:p="http://schemas.microsoft.com/office/2006/metadata/properties" xmlns:ns1="http://schemas.microsoft.com/sharepoint/v3" xmlns:ns2="0feec74c-ecc7-44c3-9c64-3623cf89ed41" xmlns:ns3="1f707338-ea0f-4fe5-baee-59b996692b22" targetNamespace="http://schemas.microsoft.com/office/2006/metadata/properties" ma:root="true" ma:fieldsID="d4e90b57406cfd253bd268c9429fcd51" ns1:_="" ns2:_="" ns3:_="">
     <xsd:import namespace="http://schemas.microsoft.com/sharepoint/v3"/>
@@ -13123,20 +13693,7 @@
 </ct:contentTypeSchema>
 </file>
 
-<file path=customXml/item3.xml><?xml version="1.0" encoding="utf-8"?>
-<b:Sources xmlns:b="http://schemas.openxmlformats.org/officeDocument/2006/bibliography" xmlns="http://schemas.openxmlformats.org/officeDocument/2006/bibliography" SelectedStyle="\APASixthEditionOfficeOnline.xsl" StyleName="APA" Version="6"/>
-</file>
-
 <file path=customXml/item4.xml><?xml version="1.0" encoding="utf-8"?>
-<?mso-contentType ?>
-<FormTemplates xmlns="http://schemas.microsoft.com/sharepoint/v3/contenttype/forms">
-  <Display>DocumentLibraryForm</Display>
-  <Edit>DocumentLibraryForm</Edit>
-  <New>DocumentLibraryForm</New>
-</FormTemplates>
-</file>
-
-<file path=customXml/item5.xml><?xml version="1.0" encoding="utf-8"?>
 <p:properties xmlns:p="http://schemas.microsoft.com/office/2006/metadata/properties" xmlns:xsi="http://www.w3.org/2001/XMLSchema-instance" xmlns:pc="http://schemas.microsoft.com/office/infopath/2007/PartnerControls">
   <documentManagement>
     <Vendor xmlns="0feec74c-ecc7-44c3-9c64-3623cf89ed41">N/A</Vendor>
@@ -13178,6 +13735,15 @@
 </p:properties>
 </file>
 
+<file path=customXml/item5.xml><?xml version="1.0" encoding="utf-8"?>
+<?mso-contentType ?>
+<FormTemplates xmlns="http://schemas.microsoft.com/sharepoint/v3/contenttype/forms">
+  <Display>DocumentLibraryForm</Display>
+  <Edit>DocumentLibraryForm</Edit>
+  <New>DocumentLibraryForm</New>
+</FormTemplates>
+</file>
+
 <file path=customXml/itemProps1.xml><?xml version="1.0" encoding="utf-8"?>
 <ds:datastoreItem xmlns:ds="http://schemas.openxmlformats.org/officeDocument/2006/customXml" ds:itemID="{55AF091B-3C7A-41E3-B477-F2FDAA23CFDA}">
   <ds:schemaRefs>
@@ -13187,6 +13753,14 @@
 </file>
 
 <file path=customXml/itemProps2.xml><?xml version="1.0" encoding="utf-8"?>
+<ds:datastoreItem xmlns:ds="http://schemas.openxmlformats.org/officeDocument/2006/customXml" ds:itemID="{74219D01-7E60-4B0D-A06F-2ACE43EE004F}">
+  <ds:schemaRefs>
+    <ds:schemaRef ds:uri="http://schemas.openxmlformats.org/officeDocument/2006/bibliography"/>
+  </ds:schemaRefs>
+</ds:datastoreItem>
+</file>
+
+<file path=customXml/itemProps3.xml><?xml version="1.0" encoding="utf-8"?>
 <ds:datastoreItem xmlns:ds="http://schemas.openxmlformats.org/officeDocument/2006/customXml" ds:itemID="{6B477300-1603-4B49-BBB9-33B0A5F08033}">
   <ds:schemaRefs>
     <ds:schemaRef ds:uri="http://schemas.microsoft.com/office/2006/metadata/contentType"/>
@@ -13206,23 +13780,7 @@
 </ds:datastoreItem>
 </file>
 
-<file path=customXml/itemProps3.xml><?xml version="1.0" encoding="utf-8"?>
-<ds:datastoreItem xmlns:ds="http://schemas.openxmlformats.org/officeDocument/2006/customXml" ds:itemID="{74219D01-7E60-4B0D-A06F-2ACE43EE004F}">
-  <ds:schemaRefs>
-    <ds:schemaRef ds:uri="http://schemas.openxmlformats.org/officeDocument/2006/bibliography"/>
-  </ds:schemaRefs>
-</ds:datastoreItem>
-</file>
-
 <file path=customXml/itemProps4.xml><?xml version="1.0" encoding="utf-8"?>
-<ds:datastoreItem xmlns:ds="http://schemas.openxmlformats.org/officeDocument/2006/customXml" ds:itemID="{366689B1-7794-494D-87E1-449905832F1A}">
-  <ds:schemaRefs>
-    <ds:schemaRef ds:uri="http://schemas.microsoft.com/sharepoint/v3/contenttype/forms"/>
-  </ds:schemaRefs>
-</ds:datastoreItem>
-</file>
-
-<file path=customXml/itemProps5.xml><?xml version="1.0" encoding="utf-8"?>
 <ds:datastoreItem xmlns:ds="http://schemas.openxmlformats.org/officeDocument/2006/customXml" ds:itemID="{BE77973C-3EFF-4A22-973C-A88DE1353176}">
   <ds:schemaRefs>
     <ds:schemaRef ds:uri="http://schemas.microsoft.com/office/2006/metadata/properties"/>
@@ -13234,6 +13792,14 @@
 </ds:datastoreItem>
 </file>
 
+<file path=customXml/itemProps5.xml><?xml version="1.0" encoding="utf-8"?>
+<ds:datastoreItem xmlns:ds="http://schemas.openxmlformats.org/officeDocument/2006/customXml" ds:itemID="{366689B1-7794-494D-87E1-449905832F1A}">
+  <ds:schemaRefs>
+    <ds:schemaRef ds:uri="http://schemas.microsoft.com/sharepoint/v3/contenttype/forms"/>
+  </ds:schemaRefs>
+</ds:datastoreItem>
+</file>
+
 <file path=docMetadata/LabelInfo.xml><?xml version="1.0" encoding="utf-8"?>
 <clbl:labelList xmlns:clbl="http://schemas.microsoft.com/office/2020/mipLabelMetadata">
   <clbl:label id="{9d258917-277f-42cd-a3cd-14c4e9ee58bc}" enabled="1" method="Standard" siteId="{38ae3bcd-9579-4fd4-adda-b42e1495d55a}" contentBits="0" removed="0"/>

</xml_diff>